<commit_message>
Add test forms with Volvox carteri data
Changed to this species since there were a few good data tracks
available for it on UCSC genome hubs.
</commit_message>
<xml_diff>
--- a/scripts/add_new_species/tests/fixtures/submission_form_example/01-test-species-submission_v1.2.docx
+++ b/scripts/add_new_species/tests/fixtures/submission_form_example/01-test-species-submission_v1.2.docx
@@ -278,45 +278,35 @@
         </w:rPr>
         <w:t xml:space="preserve">the </w:t>
       </w:r>
-      <w:r>
-        <w:fldChar w:fldCharType="begin"/>
-      </w:r>
-      <w:r>
-        <w:instrText>HYPERLINK "https://genomes.scilifelab.se/contribute/"</w:instrText>
-      </w:r>
-      <w:r>
-        <w:fldChar w:fldCharType="separate"/>
-      </w:r>
-      <w:r>
-        <w:rPr>
-          <w:rStyle w:val="Hyperlink"/>
-          <w:rFonts w:ascii="Lato" w:hAnsi="Lato"/>
-          <w:sz w:val="22"/>
-          <w:szCs w:val="22"/>
-        </w:rPr>
-        <w:t>service scope</w:t>
-      </w:r>
-      <w:r>
-        <w:rPr>
-          <w:rStyle w:val="Hyperlink"/>
-          <w:rFonts w:ascii="Lato" w:hAnsi="Lato"/>
-          <w:sz w:val="22"/>
-          <w:szCs w:val="22"/>
-        </w:rPr>
-        <w:t>,</w:t>
-      </w:r>
-      <w:r>
-        <w:rPr>
-          <w:rStyle w:val="Hyperlink"/>
-          <w:rFonts w:ascii="Lato" w:hAnsi="Lato"/>
-          <w:sz w:val="22"/>
-          <w:szCs w:val="22"/>
-        </w:rPr>
-        <w:t xml:space="preserve"> requirements</w:t>
-      </w:r>
-      <w:r>
-        <w:fldChar w:fldCharType="end"/>
-      </w:r>
+      <w:hyperlink r:id="rId8" w:history="1">
+        <w:r>
+          <w:rPr>
+            <w:rStyle w:val="Hyperlink"/>
+            <w:rFonts w:ascii="Lato" w:hAnsi="Lato"/>
+            <w:sz w:val="22"/>
+            <w:szCs w:val="22"/>
+          </w:rPr>
+          <w:t>service scope</w:t>
+        </w:r>
+        <w:r>
+          <w:rPr>
+            <w:rStyle w:val="Hyperlink"/>
+            <w:rFonts w:ascii="Lato" w:hAnsi="Lato"/>
+            <w:sz w:val="22"/>
+            <w:szCs w:val="22"/>
+          </w:rPr>
+          <w:t>,</w:t>
+        </w:r>
+        <w:r>
+          <w:rPr>
+            <w:rStyle w:val="Hyperlink"/>
+            <w:rFonts w:ascii="Lato" w:hAnsi="Lato"/>
+            <w:sz w:val="22"/>
+            <w:szCs w:val="22"/>
+          </w:rPr>
+          <w:t xml:space="preserve"> requirements</w:t>
+        </w:r>
+      </w:hyperlink>
       <w:r>
         <w:rPr>
           <w:rFonts w:ascii="Lato" w:hAnsi="Lato"/>
@@ -334,27 +324,17 @@
         </w:rPr>
         <w:t xml:space="preserve"> and </w:t>
       </w:r>
-      <w:r>
-        <w:fldChar w:fldCharType="begin"/>
-      </w:r>
-      <w:r>
-        <w:instrText>HYPERLINK "https://genomes.scilifelab.se/terms/"</w:instrText>
-      </w:r>
-      <w:r>
-        <w:fldChar w:fldCharType="separate"/>
-      </w:r>
-      <w:r>
-        <w:rPr>
-          <w:rStyle w:val="Hyperlink"/>
-          <w:rFonts w:ascii="Lato" w:hAnsi="Lato"/>
-          <w:sz w:val="22"/>
-          <w:szCs w:val="22"/>
-        </w:rPr>
-        <w:t>terms of use</w:t>
-      </w:r>
-      <w:r>
-        <w:fldChar w:fldCharType="end"/>
-      </w:r>
+      <w:hyperlink r:id="rId9" w:history="1">
+        <w:r>
+          <w:rPr>
+            <w:rStyle w:val="Hyperlink"/>
+            <w:rFonts w:ascii="Lato" w:hAnsi="Lato"/>
+            <w:sz w:val="22"/>
+            <w:szCs w:val="22"/>
+          </w:rPr>
+          <w:t>terms of use</w:t>
+        </w:r>
+      </w:hyperlink>
       <w:r>
         <w:rPr>
           <w:rFonts w:ascii="Lato" w:hAnsi="Lato"/>
@@ -925,19 +905,8 @@
                 <w:color w:val="055B64"/>
                 <w:lang w:val="en-US"/>
               </w:rPr>
-              <w:t xml:space="preserve">Aspergillus </w:t>
-            </w:r>
-            <w:proofErr w:type="spellStart"/>
-            <w:r>
-              <w:rPr>
-                <w:rFonts w:ascii="Lato" w:hAnsi="Lato"/>
-                <w:bCs/>
-                <w:color w:val="055B64"/>
-                <w:lang w:val="en-US"/>
-              </w:rPr>
-              <w:t>nidulans</w:t>
-            </w:r>
-            <w:proofErr w:type="spellEnd"/>
+              <w:t>Aspergillus nidulans</w:t>
+            </w:r>
             <w:r>
               <w:rPr>
                 <w:rFonts w:ascii="Lato" w:hAnsi="Lato"/>
@@ -1032,19 +1001,8 @@
                     <w:szCs w:val="22"/>
                     <w:lang w:val="en-US"/>
                   </w:rPr>
-                  <w:t xml:space="preserve">Aspergillus </w:t>
+                  <w:t>Volvox carteri</w:t>
                 </w:r>
-                <w:proofErr w:type="spellStart"/>
-                <w:r>
-                  <w:rPr>
-                    <w:rFonts w:ascii="Lato" w:hAnsi="Lato" w:cs="Arial"/>
-                    <w:sz w:val="22"/>
-                    <w:szCs w:val="22"/>
-                    <w:lang w:val="en-US"/>
-                  </w:rPr>
-                  <w:t>nidulans</w:t>
-                </w:r>
-                <w:proofErr w:type="spellEnd"/>
               </w:p>
             </w:tc>
           </w:sdtContent>
@@ -1118,7 +1076,7 @@
                     <w:szCs w:val="22"/>
                     <w:lang w:val="en-US"/>
                   </w:rPr>
-                  <w:t xml:space="preserve">A </w:t>
+                  <w:t>A species of colonial green algae</w:t>
                 </w:r>
                 <w:r>
                   <w:rPr>
@@ -1127,7 +1085,7 @@
                     <w:szCs w:val="22"/>
                     <w:lang w:val="en-US"/>
                   </w:rPr>
-                  <w:t>filamentous fungus</w:t>
+                  <w:t xml:space="preserve">, </w:t>
                 </w:r>
                 <w:r>
                   <w:rPr>
@@ -1136,7 +1094,7 @@
                     <w:szCs w:val="22"/>
                     <w:lang w:val="en-US"/>
                   </w:rPr>
-                  <w:t xml:space="preserve"> and a test description that runs for multiple lines in the table</w:t>
+                  <w:t>and a test description that runs for multiple lines in the table</w:t>
                 </w:r>
               </w:p>
             </w:tc>
@@ -1296,7 +1254,7 @@
               </w:rPr>
               <w:t xml:space="preserve">in </w:t>
             </w:r>
-            <w:hyperlink r:id="rId8" w:history="1">
+            <w:hyperlink r:id="rId10" w:history="1">
               <w:r>
                 <w:rPr>
                   <w:rStyle w:val="Hyperlink"/>
@@ -1550,7 +1508,7 @@
               </w:rPr>
               <w:t xml:space="preserve"> </w:t>
             </w:r>
-            <w:hyperlink r:id="rId9" w:history="1">
+            <w:hyperlink r:id="rId11" w:history="1">
               <w:r>
                 <w:rPr>
                   <w:rStyle w:val="Hyperlink"/>
@@ -2102,7 +2060,7 @@
               </w:rPr>
               <w:t xml:space="preserve">. Format all reference in </w:t>
             </w:r>
-            <w:hyperlink r:id="rId10" w:history="1">
+            <w:hyperlink r:id="rId12" w:history="1">
               <w:r>
                 <w:rPr>
                   <w:rStyle w:val="Hyperlink"/>
@@ -2733,7 +2691,6 @@
               </w:rPr>
               <w:t xml:space="preserve">Tangara </w:t>
             </w:r>
-            <w:proofErr w:type="spellStart"/>
             <w:r>
               <w:rPr>
                 <w:rFonts w:ascii="Lato" w:hAnsi="Lato"/>
@@ -2741,7 +2698,6 @@
               </w:rPr>
               <w:t>seledon</w:t>
             </w:r>
-            <w:proofErr w:type="spellEnd"/>
             <w:r>
               <w:rPr>
                 <w:rFonts w:ascii="Lato" w:hAnsi="Lato"/>
@@ -3079,7 +3035,52 @@
                     <w:szCs w:val="22"/>
                     <w:lang w:val="en-US"/>
                   </w:rPr>
-                  <w:t>2025-11-26</w:t>
+                  <w:t>202</w:t>
+                </w:r>
+                <w:r>
+                  <w:rPr>
+                    <w:rFonts w:ascii="Lato" w:hAnsi="Lato" w:cs="Arial"/>
+                    <w:sz w:val="22"/>
+                    <w:szCs w:val="22"/>
+                    <w:lang w:val="en-US"/>
+                  </w:rPr>
+                  <w:t>6</w:t>
+                </w:r>
+                <w:r>
+                  <w:rPr>
+                    <w:rFonts w:ascii="Lato" w:hAnsi="Lato" w:cs="Arial"/>
+                    <w:sz w:val="22"/>
+                    <w:szCs w:val="22"/>
+                    <w:lang w:val="en-US"/>
+                  </w:rPr>
+                  <w:t>-</w:t>
+                </w:r>
+                <w:r>
+                  <w:rPr>
+                    <w:rFonts w:ascii="Lato" w:hAnsi="Lato" w:cs="Arial"/>
+                    <w:sz w:val="22"/>
+                    <w:szCs w:val="22"/>
+                    <w:lang w:val="en-US"/>
+                  </w:rPr>
+                  <w:t>03</w:t>
+                </w:r>
+                <w:r>
+                  <w:rPr>
+                    <w:rFonts w:ascii="Lato" w:hAnsi="Lato" w:cs="Arial"/>
+                    <w:sz w:val="22"/>
+                    <w:szCs w:val="22"/>
+                    <w:lang w:val="en-US"/>
+                  </w:rPr>
+                  <w:t>-</w:t>
+                </w:r>
+                <w:r>
+                  <w:rPr>
+                    <w:rFonts w:ascii="Lato" w:hAnsi="Lato" w:cs="Arial"/>
+                    <w:sz w:val="22"/>
+                    <w:szCs w:val="22"/>
+                    <w:lang w:val="en-US"/>
+                  </w:rPr>
+                  <w:t>30</w:t>
                 </w:r>
               </w:p>
             </w:tc>
@@ -3707,7 +3708,7 @@
         </w:rPr>
         <w:t xml:space="preserve">: </w:t>
       </w:r>
-      <w:hyperlink r:id="rId11" w:history="1">
+      <w:hyperlink r:id="rId13" w:history="1">
         <w:r>
           <w:rPr>
             <w:rStyle w:val="Hyperlink"/>
@@ -3726,9 +3727,9 @@
       </w:r>
     </w:p>
     <w:sectPr>
-      <w:headerReference w:type="default" r:id="rId12"/>
-      <w:footerReference w:type="even" r:id="rId13"/>
-      <w:footerReference w:type="default" r:id="rId14"/>
+      <w:headerReference w:type="default" r:id="rId14"/>
+      <w:footerReference w:type="even" r:id="rId15"/>
+      <w:footerReference w:type="default" r:id="rId16"/>
       <w:pgSz w:w="11906" w:h="16838"/>
       <w:pgMar w:top="1440" w:right="1440" w:bottom="1440" w:left="1440" w:header="708" w:footer="708" w:gutter="0"/>
       <w:pgNumType w:start="1"/>
@@ -7548,7 +7549,6 @@
     <w:rsid w:val="0017295C"/>
     <w:rsid w:val="001D1633"/>
     <w:rsid w:val="0023680B"/>
-    <w:rsid w:val="0024096E"/>
     <w:rsid w:val="002460D0"/>
     <w:rsid w:val="00246F35"/>
     <w:rsid w:val="00300519"/>
@@ -7572,6 +7572,7 @@
     <w:rsid w:val="004F7EAD"/>
     <w:rsid w:val="00567D22"/>
     <w:rsid w:val="005B3D7B"/>
+    <w:rsid w:val="005C5AC0"/>
     <w:rsid w:val="00651D01"/>
     <w:rsid w:val="0068719A"/>
     <w:rsid w:val="006B688E"/>

</xml_diff>